<commit_message>
Add planning-session log; embed reporting-architecture diagram in doc
- docs/2026-05-28-planning-session.md captures today's full discussion
  (scaffold decisions, deployment Q&A, agent design progression,
  product map correction after web search, Managed Agents choice).
- docs/build_planning_doc.py now renders the reporting-pipeline ASCII
  diagram as a monospace block in section 4 of the Word doc.

Co-Authored-By: Claude Opus 4.7 <noreply@anthropic.com>
</commit_message>
<xml_diff>
--- a/docs/Archway_Agent_Planning.docx
+++ b/docs/Archway_Agent_Planning.docx
@@ -759,7 +759,71 @@
     </w:p>
     <w:p>
       <w:r>
-        <w:t>Orchestrator → [Performance, Holdings, Sector, Market agents in parallel] → Writer → Verification → Governance → Formatter → final PPT/Word deliverable.</w:t>
+        <w:t>The reporting workflow chains agents from data → draft → quality → delivery. The orchestrator dispatches sector/data sub-agents in parallel; the writer assembles the draft; verification loops back to the writer if numbers don't tie; governance allows/rewrites/blocks the final language; the formatter produces the file.</w:t>
+      </w:r>
+    </w:p>
+    <w:p>
+      <w:pPr>
+        <w:ind w:left="288"/>
+      </w:pPr>
+      <w:r>
+        <w:rPr>
+          <w:rFonts w:ascii="Consolas" w:hAnsi="Consolas"/>
+          <w:sz w:val="18"/>
+        </w:rPr>
+        <w:t xml:space="preserve">                  ┌─────────────────┐</w:t>
+        <w:br/>
+        <w:t xml:space="preserve">                  │   Orchestrator  │  reads template, dispatches work</w:t>
+        <w:br/>
+        <w:t xml:space="preserve">                  └────────┬────────┘</w:t>
+        <w:br/>
+        <w:t xml:space="preserve">                           │</w:t>
+        <w:br/>
+        <w:t xml:space="preserve">         ┌─────────────────┼─────────────────┐</w:t>
+        <w:br/>
+        <w:t xml:space="preserve">         ▼                 ▼                 ▼</w:t>
+        <w:br/>
+        <w:t xml:space="preserve">   Performance Agent  Holdings Agent   Sector Agents (Tech, Health, ...)</w:t>
+        <w:br/>
+        <w:t xml:space="preserve">         │                 │                 │</w:t>
+        <w:br/>
+        <w:t xml:space="preserve">         └─────────────────┼─────────────────┘</w:t>
+        <w:br/>
+        <w:t xml:space="preserve">                           ▼</w:t>
+        <w:br/>
+        <w:t xml:space="preserve">                  ┌─────────────────┐</w:t>
+        <w:br/>
+        <w:t xml:space="preserve">                  │   Writer Agent  │  assembles draft from sections</w:t>
+        <w:br/>
+        <w:t xml:space="preserve">                  └────────┬────────┘</w:t>
+        <w:br/>
+        <w:t xml:space="preserve">                           ▼</w:t>
+        <w:br/>
+        <w:t xml:space="preserve">                  ┌─────────────────┐</w:t>
+        <w:br/>
+        <w:t xml:space="preserve">                  │ Verification    │  every number tied back to source</w:t>
+        <w:br/>
+        <w:t xml:space="preserve">                  │     Agent       │  → loops back to Writer if breaks</w:t>
+        <w:br/>
+        <w:t xml:space="preserve">                  └────────┬────────┘</w:t>
+        <w:br/>
+        <w:t xml:space="preserve">                           ▼</w:t>
+        <w:br/>
+        <w:t xml:space="preserve">                  ┌─────────────────┐</w:t>
+        <w:br/>
+        <w:t xml:space="preserve">                  │  Governance     │  language, mandate, disclosures</w:t>
+        <w:br/>
+        <w:t xml:space="preserve">                  │     Agent       │  → allow/rewrite/block</w:t>
+        <w:br/>
+        <w:t xml:space="preserve">                  └────────┬────────┘</w:t>
+        <w:br/>
+        <w:t xml:space="preserve">                           ▼</w:t>
+        <w:br/>
+        <w:t xml:space="preserve">                  ┌─────────────────┐</w:t>
+        <w:br/>
+        <w:t xml:space="preserve">                  │ Formatter Agent │  → Word / PPT / PDF</w:t>
+        <w:br/>
+        <w:t xml:space="preserve">                  └─────────────────┘</w:t>
       </w:r>
     </w:p>
     <w:p>

</xml_diff>